<commit_message>
Freeze audited CEAS Paper 3 submission package
</commit_message>
<xml_diff>
--- a/publication/Paper_3_Study_7/CEAS_Space_Journal/PORTAL_UPLOAD_PACKAGE/PAPER3_CEAS_COVER_LETTER.docx
+++ b/publication/Paper_3_Study_7/CEAS_Space_Journal/PORTAL_UPLOAD_PACKAGE/PAPER3_CEAS_COVER_LETTER.docx
@@ -7,7 +7,7 @@
         <w:jc w:val="right"/>
       </w:pPr>
       <w:r>
-        <w:t>September 12, 2026</w:t>
+        <w:t>September 13, 2026</w:t>
       </w:r>
     </w:p>
     <w:p>
@@ -64,7 +64,7 @@
         <w:spacing w:after="140" w:line="252" w:lineRule="auto"/>
       </w:pPr>
       <w:r>
-        <w:t>The manuscript addresses a space-systems assurance question at the intersection of cybersecurity and artificial intelligence in space: whether a learned satellite cyber-recovery selector can make an adjudicated-correct decision when trusted-looking recovery evidence may itself be false, and how that boundary changes when corroborating evidence is independently informative versus correlated with the compromised path. This aligns directly with the journal’s coverage of space systems, cybersecurity for space systems, and artificial intelligence in space.</w:t>
+        <w:t>The manuscript addresses a space-systems assurance question at the intersection of cybersecurity and artificial intelligence in space. It asks whether a learned satellite cyber-recovery selector can make the correct recovery decision when trusted-looking evidence may itself be false, and how that boundary changes when corroborating evidence is independently informative versus correlated with the compromised path. This fits the journal's coverage of space systems, cybersecurity for space systems, and artificial intelligence in space.</w:t>
       </w:r>
     </w:p>
     <w:p>
@@ -72,7 +72,7 @@
         <w:spacing w:after="140" w:line="252" w:lineRule="auto"/>
       </w:pPr>
       <w:r>
-        <w:t>The study reports experiment S7-LSO-001, a separately frozen deterministic finite assurance experiment comprising exactly 1,033 modeled observations. It exhaustively evaluates the complete eight-feature visible-state lattice for a deterministic comparator and visible-only learner, the complete nine-feature lattice for a corroboration-aware learner, and nine prespecified hidden-truth collision observations. The central result is deliberately bounded: exact learning of a visible decision boundary does not establish correctness when decisive truth is absent from the learner’s observables; corroboration can change the decision boundary, but correlated false corroboration restores the unsafe decision. The accepted execution and core outputs are hash-frozen, and a separately implemented repository auditor reconstructs all 1,033 policy decisions with zero mismatches without importing or invoking the primary analyzer.</w:t>
+        <w:t>The study reports experiment S7-LSO-001, a separately frozen deterministic finite assurance experiment comprising exactly 1,033 modeled observations. It exhaustively evaluates the complete eight-feature visible-state lattice for a deterministic comparator and visible-only learner, the complete nine-feature lattice for a corroboration-aware learner, and nine prespecified hidden-truth collision observations. The result is intentionally narrow: learning the visible decision boundary does not establish correctness when decisive truth is missing from the learner's inputs. Corroborating evidence can change that boundary, but the unsafe decision returns when the corroborating path shares the same false state. The accepted execution and core outputs are hash-frozen, and a separately implemented repository auditor reconstructs all 1,033 policy decisions with zero mismatches without importing or invoking the primary analyzer.</w:t>
       </w:r>
     </w:p>
     <w:p>
@@ -337,7 +337,7 @@
         <w:spacing w:after="140" w:line="252" w:lineRule="auto"/>
       </w:pPr>
       <w:r>
-        <w:t>OpenAI ChatGPT, accessed through the ChatGPT web interface, was used during Study 7 development and manuscript preparation as an interactive research, coding, verification, and writing assistant. Before the results freeze, it assisted with protocol refinement, code and test drafting, repository and audit documentation, and verification-oriented review; after the freeze, it assisted with manuscript structuring and drafting, literature-source verification, compliance checking, and language refinement. The author made and approved all research decisions, controlled the repository and experimental execution, reviewed and accepted AI-assisted code and text, verified the frozen outputs and numerical claims, and remains solely accountable for the manuscript. This use is disclosed in Methods Section 3.5.</w:t>
+        <w:t>OpenAI ChatGPT, accessed through the ChatGPT web interface, was used as an interactive assistant during Study 7 development and manuscript preparation. Before the results freeze, it assisted with protocol refinement, code and test drafting, repository and audit documentation, and verification review. After the freeze, it assisted with manuscript organization and drafting, literature-source verification, compliance checking, and language refinement. I made and approved the research decisions, controlled the repository and experimental execution, reviewed the code and text changes, and verified the frozen outputs and numerical claims. This use is disclosed in Methods Section 3.5.</w:t>
       </w:r>
     </w:p>
     <w:p>

</xml_diff>

<commit_message>
Remove unrelated JSSE study from CEAS Paper 3 materials
</commit_message>
<xml_diff>
--- a/publication/Paper_3_Study_7/CEAS_Space_Journal/PORTAL_UPLOAD_PACKAGE/PAPER3_CEAS_COVER_LETTER.docx
+++ b/publication/Paper_3_Study_7/CEAS_Space_Journal/PORTAL_UPLOAD_PACKAGE/PAPER3_CEAS_COVER_LETTER.docx
@@ -275,50 +275,6 @@
                 <w:sz w:val="18"/>
               </w:rPr>
               <w:t>Contact-aware cryptographic agility; distinct mechanism and population.</w:t>
-            </w:r>
-          </w:p>
-        </w:tc>
-      </w:tr>
-      <w:tr>
-        <w:tc>
-          <w:tcPr>
-            <w:tcW w:type="dxa" w:w="3216"/>
-          </w:tcPr>
-          <w:p>
-            <w:r>
-              <w:rPr>
-                <w:rFonts w:ascii="Times New Roman" w:hAnsi="Times New Roman"/>
-                <w:sz w:val="18"/>
-              </w:rPr>
-              <w:t>Journal of Space Safety Engineering</w:t>
-            </w:r>
-          </w:p>
-        </w:tc>
-        <w:tc>
-          <w:tcPr>
-            <w:tcW w:type="dxa" w:w="3216"/>
-          </w:tcPr>
-          <w:p>
-            <w:r>
-              <w:rPr>
-                <w:rFonts w:ascii="Times New Roman" w:hAnsi="Times New Roman"/>
-                <w:sz w:val="18"/>
-              </w:rPr>
-              <w:t>Separate repository</w:t>
-            </w:r>
-          </w:p>
-        </w:tc>
-        <w:tc>
-          <w:tcPr>
-            <w:tcW w:type="dxa" w:w="3216"/>
-          </w:tcPr>
-          <w:p>
-            <w:r>
-              <w:rPr>
-                <w:rFonts w:ascii="Times New Roman" w:hAnsi="Times New Roman"/>
-                <w:sz w:val="18"/>
-              </w:rPr>
-              <w:t>Software supply-chain assurance for spacecraft flight software; no Study-7 data, model, or endpoints.</w:t>
             </w:r>
           </w:p>
         </w:tc>

</xml_diff>